<commit_message>
Complete first-phase review and verify external configuration gaps
</commit_message>
<xml_diff>
--- a/valmistelu/tarkistuspaketti/Hietakulma-tarkistuspaketti-luonnos.docx
+++ b/valmistelu/tarkistuspaketti/Hietakulma-tarkistuspaketti-luonnos.docx
@@ -2463,7 +2463,7 @@
                 <w:b w:val="0"/>
                 <w:sz w:val="18"/>
               </w:rPr>
-              <w:t>Kattoristikkosivun NR-asennus- ja tuentaohjeen linkki. Tiedosto noin 14,7 MB. Sisältö ja versio eivät vielä tarkastettu.</w:t>
+              <w:t>11-sivuinen PDF. Sivut 1, 10 ja 11 luettu kuvina: RIL 248-2008:n liite C, päiväys 15.4.2008; viimeisenä asennustyön tarkastuslomake. Nykyinen soveltuvuus vahvistettava.</w:t>
             </w:r>
           </w:p>
         </w:tc>
@@ -2585,6 +2585,11 @@
     <w:p>
       <w:r>
         <w:t>Tarvitaan vahvistus nykyisestä sertifikaatista, ilmoitetusta laitoksesta, hyväksytystä DoP:sta, allekirjoittajasta ja asiakasjakeluun tarkoitetusta tiedostosta. Uutta DoP:ta ei laadita yhdistämällä eri vuosien tietoja.</w:t>
+      </w:r>
+    </w:p>
+    <w:p>
+      <w:r>
+        <w:t>V03:n PDF-metatiedoissa on luontipäivä 11.10.2024, mutta ohjeen ja tarkastuslomakkeen painettu päiväys on 15.4.2008. Metatieto ei osoita ohjeen päivitystä. Jorma vahvistaa nykyisen ohjeversion ja lomakkeen; vanhan lähteen säädösviitteitä tai mitoitusarvoja ei siirretä uusiin ohjeisiin ilman tarkistusta. Muita V03:n sivuja ei tässä lähdetarkistuksessa arvioitu teknisesti.</w:t>
       </w:r>
     </w:p>
     <w:p>
@@ -13376,7 +13381,7 @@
     </w:p>
     <w:p>
       <w:r>
-        <w:t>V03:n tiedoston ajantasaisuus ja sopivuus vahvistetaan, ennen kuin se merkitään N1:een hyväksytyksi ohjeeksi. Tässä luonnoksessa ei anneta nostopisteitä, sidepuumittoja, kiinnitysmääriä tai työnaikaisia tuentavälejä.</w:t>
+        <w:t>V03:n ohje ja sen sivun 11 tarkastuslomake on päivätty 15.4.2008. Jorma vahvistaa niiden nykyisen korvaavan tai hyväksytyn version ennen merkitsemistä N1:een. N2 on vastaanoton seuranta, ei kyseisen asennustarkastuksen korvaava lomake. Tässä luonnoksessa ei anneta nostopisteitä, sidepuumittoja, kiinnitysmääriä tai työnaikaisia tuentavälejä.</w:t>
       </w:r>
     </w:p>
     <w:p>

</xml_diff>